<commit_message>
Ensure annual top 100 brain paper selection
</commit_message>
<xml_diff>
--- a/paper/review_en.docx
+++ b/paper/review_en.docx
@@ -12,7 +12,7 @@
     </w:p>
     <w:p>
       <w:r>
-        <w:t>Generated: 2026-06-26 | Dataset: 12,060 papers</w:t>
+        <w:t>Generated: 2026-06-26 | Dataset: 12,700 papers</w:t>
       </w:r>
     </w:p>
     <w:p>
@@ -25,7 +25,7 @@
     </w:p>
     <w:p>
       <w:r>
-        <w:t>This draft review maps brain research from 1900 through 2026, investigating up to 1,000 candidate papers per year from free Semantic Scholar metadata and selecting 100 papers per year by citation count. The final 12,060 selected papers are organized into neuroimaging, electrophysiology, cellular and molecular neuroscience, cognitive and systems neuroscience, clinical neurology, development and connectomics, neurotechnology, computational neuroscience, cerebrovascular and injury research, and broad reviews.</w:t>
+        <w:t>This draft review maps brain research from 1900 through 2026, investigating up to 1,000 candidate papers per year from free Semantic Scholar metadata and selecting 100 papers per year by citation count. The final 12,700 selected papers are organized into neuroimaging, electrophysiology, cellular and molecular neuroscience, cognitive and systems neuroscience, clinical neurology, development and connectomics, neurotechnology, computational neuroscience, cerebrovascular and injury research, and broad reviews.</w:t>
       </w:r>
     </w:p>
     <w:p>
@@ -41,7 +41,7 @@
         <w:pStyle w:val="ListBullet"/>
       </w:pPr>
       <w:r>
-        <w:t>The selected papers account for 7,137,997 citations in the selected set, with the largest citation mass in 2005.</w:t>
+        <w:t>The selected papers account for 7,162,717 citations in the selected set, with the largest citation mass in 2005.</w:t>
       </w:r>
     </w:p>
     <w:p>
@@ -49,7 +49,7 @@
         <w:pStyle w:val="ListBullet"/>
       </w:pPr>
       <w:r>
-        <w:t>The largest taxonomy category is General Brain Science and Reviews (5,436 papers).</w:t>
+        <w:t>The largest taxonomy category is General Brain Science and Reviews (5,928 papers).</w:t>
       </w:r>
     </w:p>
     <w:p>
@@ -81,7 +81,7 @@
         <w:pStyle w:val="ListBullet"/>
       </w:pPr>
       <w:r>
-        <w:t>General Brain Science and Reviews: 5,436 papers (45.1%)</w:t>
+        <w:t>General Brain Science and Reviews: 5,928 papers (46.7%)</w:t>
       </w:r>
     </w:p>
     <w:p>
@@ -89,7 +89,7 @@
         <w:pStyle w:val="ListBullet"/>
       </w:pPr>
       <w:r>
-        <w:t>Clinical Neurology and Neurodegeneration: 1,834 papers (15.2%)</w:t>
+        <w:t>Clinical Neurology and Neurodegeneration: 1,838 papers (14.5%)</w:t>
       </w:r>
     </w:p>
     <w:p>
@@ -97,7 +97,7 @@
         <w:pStyle w:val="ListBullet"/>
       </w:pPr>
       <w:r>
-        <w:t>Cellular, Molecular, and Synaptic Neuroscience: 1,674 papers (13.9%)</w:t>
+        <w:t>Cellular, Molecular, and Synaptic Neuroscience: 1,730 papers (13.6%)</w:t>
       </w:r>
     </w:p>
     <w:p>
@@ -105,7 +105,7 @@
         <w:pStyle w:val="ListBullet"/>
       </w:pPr>
       <w:r>
-        <w:t>Cognitive and Systems Neuroscience: 708 papers (5.9%)</w:t>
+        <w:t>Cognitive and Systems Neuroscience: 720 papers (5.7%)</w:t>
       </w:r>
     </w:p>
     <w:p>
@@ -113,7 +113,7 @@
         <w:pStyle w:val="ListBullet"/>
       </w:pPr>
       <w:r>
-        <w:t>Brain Development, Plasticity, and Connectomics: 695 papers (5.8%)</w:t>
+        <w:t>Brain Development, Plasticity, and Connectomics: 711 papers (5.6%)</w:t>
       </w:r>
     </w:p>
     <w:p>
@@ -121,7 +121,7 @@
         <w:pStyle w:val="ListBullet"/>
       </w:pPr>
       <w:r>
-        <w:t>EEG, MEG, and Electrophysiology: 598 papers (5.0%)</w:t>
+        <w:t>EEG, MEG, and Electrophysiology: 647 papers (5.1%)</w:t>
       </w:r>
     </w:p>
     <w:p>
@@ -129,7 +129,7 @@
         <w:pStyle w:val="ListBullet"/>
       </w:pPr>
       <w:r>
-        <w:t>Cerebrovascular, Metabolism, and Brain Injury: 478 papers (4.0%)</w:t>
+        <w:t>Cerebrovascular, Metabolism, and Brain Injury: 484 papers (3.8%)</w:t>
       </w:r>
     </w:p>
     <w:p>
@@ -137,7 +137,7 @@
         <w:pStyle w:val="ListBullet"/>
       </w:pPr>
       <w:r>
-        <w:t>Neuroimaging and Brain Mapping: 464 papers (3.8%)</w:t>
+        <w:t>Neuroimaging and Brain Mapping: 471 papers (3.7%)</w:t>
       </w:r>
     </w:p>
     <w:p>
@@ -145,7 +145,7 @@
         <w:pStyle w:val="ListBullet"/>
       </w:pPr>
       <w:r>
-        <w:t>Computational Neuroscience and AI: 118 papers (1.0%)</w:t>
+        <w:t>Computational Neuroscience and AI: 117 papers (0.9%)</w:t>
       </w:r>
     </w:p>
     <w:p>
@@ -153,7 +153,7 @@
         <w:pStyle w:val="ListBullet"/>
       </w:pPr>
       <w:r>
-        <w:t>Brain Stimulation, Neurotechnology, and BCI: 55 papers (0.5%)</w:t>
+        <w:t>Brain Stimulation, Neurotechnology, and BCI: 54 papers (0.4%)</w:t>
       </w:r>
     </w:p>
     <w:p>

</xml_diff>